<commit_message>
Fix: Strictly sync and reflect exact Google Drive folders and files for all 8 teachers
</commit_message>
<xml_diff>
--- a/data/corrected/BAO_CAO_CHI_TIET_TIEN_DO_9_CHU_KY_TUAN_GOOGLE_DRIVE.docx
+++ b/data/corrected/BAO_CAO_CHI_TIET_TIEN_DO_9_CHU_KY_TUAN_GOOGLE_DRIVE.docx
@@ -552,11 +552,13 @@
               <w:rPr>
                 <w:b/>
                 <w:color w:val="0D652D"/>
-                <w:sz w:val="17"/>
+                <w:sz w:val="16"/>
               </w:rPr>
               <w:t>✔ Đã nộp</w:t>
               <w:br/>
-              <w:t>(4 tệp)</w:t>
+              <w:t>(9 tệp)</w:t>
+              <w:br/>
+              <w:t>04/10/2026</w:t>
             </w:r>
           </w:p>
         </w:tc>
@@ -579,11 +581,13 @@
               <w:rPr>
                 <w:b/>
                 <w:color w:val="0D652D"/>
-                <w:sz w:val="17"/>
+                <w:sz w:val="16"/>
               </w:rPr>
               <w:t>✔ Đã nộp</w:t>
               <w:br/>
-              <w:t>(4 tệp)</w:t>
+              <w:t>(8 tệp)</w:t>
+              <w:br/>
+              <w:t>04/10/2026</w:t>
             </w:r>
           </w:p>
         </w:tc>
@@ -596,7 +600,6 @@
               <w:left w:w="20" w:type="dxa"/>
               <w:right w:w="20" w:type="dxa"/>
             </w:tcMar>
-            <w:shd w:fill="E6F4EA"/>
           </w:tcPr>
           <w:p>
             <w:pPr>
@@ -604,13 +607,14 @@
             </w:pPr>
             <w:r>
               <w:rPr>
-                <w:b/>
-                <w:color w:val="0D652D"/>
-                <w:sz w:val="17"/>
+                <w:color w:val="808080"/>
+                <w:sz w:val="14"/>
               </w:rPr>
-              <w:t>✔ Đã nộp</w:t>
+              <w:t>○ Trống</w:t>
               <w:br/>
-              <w:t>(4 tệp)</w:t>
+              <w:t>(Chưa đến kỳ)</w:t>
+              <w:br/>
+              <w:t>04/10/2026</w:t>
             </w:r>
           </w:p>
         </w:tc>
@@ -623,7 +627,6 @@
               <w:left w:w="20" w:type="dxa"/>
               <w:right w:w="20" w:type="dxa"/>
             </w:tcMar>
-            <w:shd w:fill="E6F4EA"/>
           </w:tcPr>
           <w:p>
             <w:pPr>
@@ -631,13 +634,14 @@
             </w:pPr>
             <w:r>
               <w:rPr>
-                <w:b/>
-                <w:color w:val="0D652D"/>
-                <w:sz w:val="17"/>
+                <w:color w:val="808080"/>
+                <w:sz w:val="14"/>
               </w:rPr>
-              <w:t>✔ Đã nộp</w:t>
+              <w:t>○ Trống</w:t>
               <w:br/>
-              <w:t>(4 tệp)</w:t>
+              <w:t>(Chưa đến kỳ)</w:t>
+              <w:br/>
+              <w:t>04/10/2026</w:t>
             </w:r>
           </w:p>
         </w:tc>
@@ -650,7 +654,6 @@
               <w:left w:w="20" w:type="dxa"/>
               <w:right w:w="20" w:type="dxa"/>
             </w:tcMar>
-            <w:shd w:fill="E6F4EA"/>
           </w:tcPr>
           <w:p>
             <w:pPr>
@@ -658,13 +661,14 @@
             </w:pPr>
             <w:r>
               <w:rPr>
-                <w:b/>
-                <w:color w:val="0D652D"/>
-                <w:sz w:val="17"/>
+                <w:color w:val="808080"/>
+                <w:sz w:val="14"/>
               </w:rPr>
-              <w:t>✔ Đã nộp</w:t>
+              <w:t>○ Trống</w:t>
               <w:br/>
-              <w:t>(4 tệp)</w:t>
+              <w:t>(Chưa đến kỳ)</w:t>
+              <w:br/>
+              <w:t>04/10/2026</w:t>
             </w:r>
           </w:p>
         </w:tc>
@@ -677,7 +681,6 @@
               <w:left w:w="20" w:type="dxa"/>
               <w:right w:w="20" w:type="dxa"/>
             </w:tcMar>
-            <w:shd w:fill="E6F4EA"/>
           </w:tcPr>
           <w:p>
             <w:pPr>
@@ -685,13 +688,14 @@
             </w:pPr>
             <w:r>
               <w:rPr>
-                <w:b/>
-                <w:color w:val="0D652D"/>
-                <w:sz w:val="17"/>
+                <w:color w:val="808080"/>
+                <w:sz w:val="14"/>
               </w:rPr>
-              <w:t>✔ Đã nộp</w:t>
+              <w:t>○ Trống</w:t>
               <w:br/>
-              <w:t>(4 tệp)</w:t>
+              <w:t>(Chưa đến kỳ)</w:t>
+              <w:br/>
+              <w:t>04/10/2026</w:t>
             </w:r>
           </w:p>
         </w:tc>
@@ -704,7 +708,6 @@
               <w:left w:w="20" w:type="dxa"/>
               <w:right w:w="20" w:type="dxa"/>
             </w:tcMar>
-            <w:shd w:fill="E6F4EA"/>
           </w:tcPr>
           <w:p>
             <w:pPr>
@@ -712,13 +715,14 @@
             </w:pPr>
             <w:r>
               <w:rPr>
-                <w:b/>
-                <w:color w:val="0D652D"/>
-                <w:sz w:val="17"/>
+                <w:color w:val="808080"/>
+                <w:sz w:val="14"/>
               </w:rPr>
-              <w:t>✔ Đã nộp</w:t>
+              <w:t>○ Trống</w:t>
               <w:br/>
-              <w:t>(4 tệp)</w:t>
+              <w:t>(Chưa đến kỳ)</w:t>
+              <w:br/>
+              <w:t>04/10/2026</w:t>
             </w:r>
           </w:p>
         </w:tc>
@@ -731,7 +735,6 @@
               <w:left w:w="20" w:type="dxa"/>
               <w:right w:w="20" w:type="dxa"/>
             </w:tcMar>
-            <w:shd w:fill="E6F4EA"/>
           </w:tcPr>
           <w:p>
             <w:pPr>
@@ -739,13 +742,14 @@
             </w:pPr>
             <w:r>
               <w:rPr>
-                <w:b/>
-                <w:color w:val="0D652D"/>
-                <w:sz w:val="17"/>
+                <w:color w:val="808080"/>
+                <w:sz w:val="14"/>
               </w:rPr>
-              <w:t>✔ Đã nộp</w:t>
+              <w:t>○ Trống</w:t>
               <w:br/>
-              <w:t>(4 tệp)</w:t>
+              <w:t>(Chưa đến kỳ)</w:t>
+              <w:br/>
+              <w:t>04/10/2026</w:t>
             </w:r>
           </w:p>
         </w:tc>
@@ -758,7 +762,6 @@
               <w:left w:w="20" w:type="dxa"/>
               <w:right w:w="20" w:type="dxa"/>
             </w:tcMar>
-            <w:shd w:fill="E6F4EA"/>
           </w:tcPr>
           <w:p>
             <w:pPr>
@@ -766,13 +769,14 @@
             </w:pPr>
             <w:r>
               <w:rPr>
-                <w:b/>
-                <w:color w:val="0D652D"/>
-                <w:sz w:val="17"/>
+                <w:color w:val="808080"/>
+                <w:sz w:val="14"/>
               </w:rPr>
-              <w:t>✔ Đã nộp</w:t>
+              <w:t>○ Trống</w:t>
               <w:br/>
-              <w:t>(4 tệp)</w:t>
+              <w:t>(Chưa đến kỳ)</w:t>
+              <w:br/>
+              <w:t>04/10/2026</w:t>
             </w:r>
           </w:p>
         </w:tc>
@@ -850,11 +854,13 @@
               <w:rPr>
                 <w:b/>
                 <w:color w:val="0D652D"/>
-                <w:sz w:val="17"/>
+                <w:sz w:val="16"/>
               </w:rPr>
               <w:t>✔ Đã nộp</w:t>
               <w:br/>
-              <w:t>(10 tệp)</w:t>
+              <w:t>(15 tệp)</w:t>
+              <w:br/>
+              <w:t>04/10/2026</w:t>
             </w:r>
           </w:p>
         </w:tc>
@@ -877,11 +883,13 @@
               <w:rPr>
                 <w:b/>
                 <w:color w:val="0D652D"/>
-                <w:sz w:val="17"/>
+                <w:sz w:val="16"/>
               </w:rPr>
               <w:t>✔ Đã nộp</w:t>
               <w:br/>
-              <w:t>(10 tệp)</w:t>
+              <w:t>(20 tệp)</w:t>
+              <w:br/>
+              <w:t>04/10/2026</w:t>
             </w:r>
           </w:p>
         </w:tc>
@@ -894,7 +902,6 @@
               <w:left w:w="20" w:type="dxa"/>
               <w:right w:w="20" w:type="dxa"/>
             </w:tcMar>
-            <w:shd w:fill="E6F4EA"/>
           </w:tcPr>
           <w:p>
             <w:pPr>
@@ -902,13 +909,14 @@
             </w:pPr>
             <w:r>
               <w:rPr>
-                <w:b/>
-                <w:color w:val="0D652D"/>
-                <w:sz w:val="17"/>
+                <w:color w:val="808080"/>
+                <w:sz w:val="14"/>
               </w:rPr>
-              <w:t>✔ Đã nộp</w:t>
+              <w:t>○ Trống</w:t>
               <w:br/>
-              <w:t>(10 tệp)</w:t>
+              <w:t>(Chưa đến kỳ)</w:t>
+              <w:br/>
+              <w:t>04/10/2026</w:t>
             </w:r>
           </w:p>
         </w:tc>
@@ -921,7 +929,6 @@
               <w:left w:w="20" w:type="dxa"/>
               <w:right w:w="20" w:type="dxa"/>
             </w:tcMar>
-            <w:shd w:fill="E6F4EA"/>
           </w:tcPr>
           <w:p>
             <w:pPr>
@@ -929,13 +936,14 @@
             </w:pPr>
             <w:r>
               <w:rPr>
-                <w:b/>
-                <w:color w:val="0D652D"/>
-                <w:sz w:val="17"/>
+                <w:color w:val="808080"/>
+                <w:sz w:val="14"/>
               </w:rPr>
-              <w:t>✔ Đã nộp</w:t>
+              <w:t>○ Trống</w:t>
               <w:br/>
-              <w:t>(10 tệp)</w:t>
+              <w:t>(Chưa đến kỳ)</w:t>
+              <w:br/>
+              <w:t>04/10/2026</w:t>
             </w:r>
           </w:p>
         </w:tc>
@@ -948,7 +956,6 @@
               <w:left w:w="20" w:type="dxa"/>
               <w:right w:w="20" w:type="dxa"/>
             </w:tcMar>
-            <w:shd w:fill="E6F4EA"/>
           </w:tcPr>
           <w:p>
             <w:pPr>
@@ -956,13 +963,14 @@
             </w:pPr>
             <w:r>
               <w:rPr>
-                <w:b/>
-                <w:color w:val="0D652D"/>
-                <w:sz w:val="17"/>
+                <w:color w:val="808080"/>
+                <w:sz w:val="14"/>
               </w:rPr>
-              <w:t>✔ Đã nộp</w:t>
+              <w:t>○ Trống</w:t>
               <w:br/>
-              <w:t>(10 tệp)</w:t>
+              <w:t>(Chưa đến kỳ)</w:t>
+              <w:br/>
+              <w:t>04/10/2026</w:t>
             </w:r>
           </w:p>
         </w:tc>
@@ -975,7 +983,6 @@
               <w:left w:w="20" w:type="dxa"/>
               <w:right w:w="20" w:type="dxa"/>
             </w:tcMar>
-            <w:shd w:fill="E6F4EA"/>
           </w:tcPr>
           <w:p>
             <w:pPr>
@@ -983,13 +990,14 @@
             </w:pPr>
             <w:r>
               <w:rPr>
-                <w:b/>
-                <w:color w:val="0D652D"/>
-                <w:sz w:val="17"/>
+                <w:color w:val="808080"/>
+                <w:sz w:val="14"/>
               </w:rPr>
-              <w:t>✔ Đã nộp</w:t>
+              <w:t>○ Trống</w:t>
               <w:br/>
-              <w:t>(10 tệp)</w:t>
+              <w:t>(Chưa đến kỳ)</w:t>
+              <w:br/>
+              <w:t>04/10/2026</w:t>
             </w:r>
           </w:p>
         </w:tc>
@@ -1002,7 +1010,6 @@
               <w:left w:w="20" w:type="dxa"/>
               <w:right w:w="20" w:type="dxa"/>
             </w:tcMar>
-            <w:shd w:fill="E6F4EA"/>
           </w:tcPr>
           <w:p>
             <w:pPr>
@@ -1010,13 +1017,14 @@
             </w:pPr>
             <w:r>
               <w:rPr>
-                <w:b/>
-                <w:color w:val="0D652D"/>
-                <w:sz w:val="17"/>
+                <w:color w:val="808080"/>
+                <w:sz w:val="14"/>
               </w:rPr>
-              <w:t>✔ Đã nộp</w:t>
+              <w:t>○ Trống</w:t>
               <w:br/>
-              <w:t>(10 tệp)</w:t>
+              <w:t>(Chưa đến kỳ)</w:t>
+              <w:br/>
+              <w:t>04/10/2026</w:t>
             </w:r>
           </w:p>
         </w:tc>
@@ -1029,7 +1037,6 @@
               <w:left w:w="20" w:type="dxa"/>
               <w:right w:w="20" w:type="dxa"/>
             </w:tcMar>
-            <w:shd w:fill="E6F4EA"/>
           </w:tcPr>
           <w:p>
             <w:pPr>
@@ -1037,13 +1044,14 @@
             </w:pPr>
             <w:r>
               <w:rPr>
-                <w:b/>
-                <w:color w:val="0D652D"/>
-                <w:sz w:val="17"/>
+                <w:color w:val="808080"/>
+                <w:sz w:val="14"/>
               </w:rPr>
-              <w:t>✔ Đã nộp</w:t>
+              <w:t>○ Trống</w:t>
               <w:br/>
-              <w:t>(10 tệp)</w:t>
+              <w:t>(Chưa đến kỳ)</w:t>
+              <w:br/>
+              <w:t>04/10/2026</w:t>
             </w:r>
           </w:p>
         </w:tc>
@@ -1056,7 +1064,6 @@
               <w:left w:w="20" w:type="dxa"/>
               <w:right w:w="20" w:type="dxa"/>
             </w:tcMar>
-            <w:shd w:fill="E6F4EA"/>
           </w:tcPr>
           <w:p>
             <w:pPr>
@@ -1064,13 +1071,14 @@
             </w:pPr>
             <w:r>
               <w:rPr>
-                <w:b/>
-                <w:color w:val="0D652D"/>
-                <w:sz w:val="17"/>
+                <w:color w:val="808080"/>
+                <w:sz w:val="14"/>
               </w:rPr>
-              <w:t>✔ Đã nộp</w:t>
+              <w:t>○ Trống</w:t>
               <w:br/>
-              <w:t>(10 tệp)</w:t>
+              <w:t>(Chưa đến kỳ)</w:t>
+              <w:br/>
+              <w:t>04/10/2026</w:t>
             </w:r>
           </w:p>
         </w:tc>
@@ -1148,11 +1156,13 @@
               <w:rPr>
                 <w:b/>
                 <w:color w:val="0D652D"/>
-                <w:sz w:val="17"/>
+                <w:sz w:val="16"/>
               </w:rPr>
               <w:t>✔ Đã nộp</w:t>
               <w:br/>
-              <w:t>(6 tệp)</w:t>
+              <w:t>(13 tệp)</w:t>
+              <w:br/>
+              <w:t>04/10/2026</w:t>
             </w:r>
           </w:p>
         </w:tc>
@@ -1175,11 +1185,13 @@
               <w:rPr>
                 <w:b/>
                 <w:color w:val="0D652D"/>
-                <w:sz w:val="17"/>
+                <w:sz w:val="16"/>
               </w:rPr>
               <w:t>✔ Đã nộp</w:t>
               <w:br/>
-              <w:t>(6 tệp)</w:t>
+              <w:t>(8 tệp)</w:t>
+              <w:br/>
+              <w:t>04/10/2026</w:t>
             </w:r>
           </w:p>
         </w:tc>
@@ -1192,7 +1204,6 @@
               <w:left w:w="20" w:type="dxa"/>
               <w:right w:w="20" w:type="dxa"/>
             </w:tcMar>
-            <w:shd w:fill="E6F4EA"/>
           </w:tcPr>
           <w:p>
             <w:pPr>
@@ -1200,13 +1211,14 @@
             </w:pPr>
             <w:r>
               <w:rPr>
-                <w:b/>
-                <w:color w:val="0D652D"/>
-                <w:sz w:val="17"/>
+                <w:color w:val="808080"/>
+                <w:sz w:val="14"/>
               </w:rPr>
-              <w:t>✔ Đã nộp</w:t>
+              <w:t>○ Trống</w:t>
               <w:br/>
-              <w:t>(6 tệp)</w:t>
+              <w:t>(Chưa đến kỳ)</w:t>
+              <w:br/>
+              <w:t>04/10/2026</w:t>
             </w:r>
           </w:p>
         </w:tc>
@@ -1219,7 +1231,6 @@
               <w:left w:w="20" w:type="dxa"/>
               <w:right w:w="20" w:type="dxa"/>
             </w:tcMar>
-            <w:shd w:fill="E6F4EA"/>
           </w:tcPr>
           <w:p>
             <w:pPr>
@@ -1227,13 +1238,14 @@
             </w:pPr>
             <w:r>
               <w:rPr>
-                <w:b/>
-                <w:color w:val="0D652D"/>
-                <w:sz w:val="17"/>
+                <w:color w:val="808080"/>
+                <w:sz w:val="14"/>
               </w:rPr>
-              <w:t>✔ Đã nộp</w:t>
+              <w:t>○ Trống</w:t>
               <w:br/>
-              <w:t>(6 tệp)</w:t>
+              <w:t>(Chưa đến kỳ)</w:t>
+              <w:br/>
+              <w:t>04/10/2026</w:t>
             </w:r>
           </w:p>
         </w:tc>
@@ -1246,7 +1258,6 @@
               <w:left w:w="20" w:type="dxa"/>
               <w:right w:w="20" w:type="dxa"/>
             </w:tcMar>
-            <w:shd w:fill="E6F4EA"/>
           </w:tcPr>
           <w:p>
             <w:pPr>
@@ -1254,13 +1265,14 @@
             </w:pPr>
             <w:r>
               <w:rPr>
-                <w:b/>
-                <w:color w:val="0D652D"/>
-                <w:sz w:val="17"/>
+                <w:color w:val="808080"/>
+                <w:sz w:val="14"/>
               </w:rPr>
-              <w:t>✔ Đã nộp</w:t>
+              <w:t>○ Trống</w:t>
               <w:br/>
-              <w:t>(6 tệp)</w:t>
+              <w:t>(Chưa đến kỳ)</w:t>
+              <w:br/>
+              <w:t>04/10/2026</w:t>
             </w:r>
           </w:p>
         </w:tc>
@@ -1273,7 +1285,6 @@
               <w:left w:w="20" w:type="dxa"/>
               <w:right w:w="20" w:type="dxa"/>
             </w:tcMar>
-            <w:shd w:fill="E6F4EA"/>
           </w:tcPr>
           <w:p>
             <w:pPr>
@@ -1281,13 +1292,14 @@
             </w:pPr>
             <w:r>
               <w:rPr>
-                <w:b/>
-                <w:color w:val="0D652D"/>
-                <w:sz w:val="17"/>
+                <w:color w:val="808080"/>
+                <w:sz w:val="14"/>
               </w:rPr>
-              <w:t>✔ Đã nộp</w:t>
+              <w:t>○ Trống</w:t>
               <w:br/>
-              <w:t>(6 tệp)</w:t>
+              <w:t>(Chưa đến kỳ)</w:t>
+              <w:br/>
+              <w:t>04/10/2026</w:t>
             </w:r>
           </w:p>
         </w:tc>
@@ -1300,7 +1312,6 @@
               <w:left w:w="20" w:type="dxa"/>
               <w:right w:w="20" w:type="dxa"/>
             </w:tcMar>
-            <w:shd w:fill="E6F4EA"/>
           </w:tcPr>
           <w:p>
             <w:pPr>
@@ -1308,13 +1319,14 @@
             </w:pPr>
             <w:r>
               <w:rPr>
-                <w:b/>
-                <w:color w:val="0D652D"/>
-                <w:sz w:val="17"/>
+                <w:color w:val="808080"/>
+                <w:sz w:val="14"/>
               </w:rPr>
-              <w:t>✔ Đã nộp</w:t>
+              <w:t>○ Trống</w:t>
               <w:br/>
-              <w:t>(6 tệp)</w:t>
+              <w:t>(Chưa đến kỳ)</w:t>
+              <w:br/>
+              <w:t>04/10/2026</w:t>
             </w:r>
           </w:p>
         </w:tc>
@@ -1327,7 +1339,6 @@
               <w:left w:w="20" w:type="dxa"/>
               <w:right w:w="20" w:type="dxa"/>
             </w:tcMar>
-            <w:shd w:fill="E6F4EA"/>
           </w:tcPr>
           <w:p>
             <w:pPr>
@@ -1335,13 +1346,14 @@
             </w:pPr>
             <w:r>
               <w:rPr>
-                <w:b/>
-                <w:color w:val="0D652D"/>
-                <w:sz w:val="17"/>
+                <w:color w:val="808080"/>
+                <w:sz w:val="14"/>
               </w:rPr>
-              <w:t>✔ Đã nộp</w:t>
+              <w:t>○ Trống</w:t>
               <w:br/>
-              <w:t>(6 tệp)</w:t>
+              <w:t>(Chưa đến kỳ)</w:t>
+              <w:br/>
+              <w:t>04/10/2026</w:t>
             </w:r>
           </w:p>
         </w:tc>
@@ -1354,7 +1366,6 @@
               <w:left w:w="20" w:type="dxa"/>
               <w:right w:w="20" w:type="dxa"/>
             </w:tcMar>
-            <w:shd w:fill="E6F4EA"/>
           </w:tcPr>
           <w:p>
             <w:pPr>
@@ -1362,13 +1373,14 @@
             </w:pPr>
             <w:r>
               <w:rPr>
-                <w:b/>
-                <w:color w:val="0D652D"/>
-                <w:sz w:val="17"/>
+                <w:color w:val="808080"/>
+                <w:sz w:val="14"/>
               </w:rPr>
-              <w:t>✔ Đã nộp</w:t>
+              <w:t>○ Trống</w:t>
               <w:br/>
-              <w:t>(6 tệp)</w:t>
+              <w:t>(Chưa đến kỳ)</w:t>
+              <w:br/>
+              <w:t>04/10/2026</w:t>
             </w:r>
           </w:p>
         </w:tc>
@@ -1436,7 +1448,7 @@
               <w:left w:w="20" w:type="dxa"/>
               <w:right w:w="20" w:type="dxa"/>
             </w:tcMar>
-            <w:shd w:fill="E6F4EA"/>
+            <w:shd w:fill="FCE8E6"/>
           </w:tcPr>
           <w:p>
             <w:pPr>
@@ -1444,13 +1456,14 @@
             </w:pPr>
             <w:r>
               <w:rPr>
-                <w:b/>
-                <w:color w:val="0D652D"/>
-                <w:sz w:val="17"/>
+                <w:color w:val="C5221F"/>
+                <w:sz w:val="15"/>
               </w:rPr>
-              <w:t>✔ Đã nộp</w:t>
+              <w:t>❌ Chưa nộp</w:t>
               <w:br/>
-              <w:t>(4 tệp)</w:t>
+              <w:t>(0 tệp)</w:t>
+              <w:br/>
+              <w:t>04/10/2026</w:t>
             </w:r>
           </w:p>
         </w:tc>
@@ -1463,7 +1476,7 @@
               <w:left w:w="20" w:type="dxa"/>
               <w:right w:w="20" w:type="dxa"/>
             </w:tcMar>
-            <w:shd w:fill="E6F4EA"/>
+            <w:shd w:fill="FEF7E0"/>
           </w:tcPr>
           <w:p>
             <w:pPr>
@@ -1471,13 +1484,14 @@
             </w:pPr>
             <w:r>
               <w:rPr>
-                <w:b/>
-                <w:color w:val="0D652D"/>
-                <w:sz w:val="17"/>
+                <w:color w:val="B06000"/>
+                <w:sz w:val="15"/>
               </w:rPr>
-              <w:t>✔ Đã nộp</w:t>
+              <w:t>⏳ Chưa nộp</w:t>
               <w:br/>
-              <w:t>(4 tệp)</w:t>
+              <w:t>(Đang thu đợt 2)</w:t>
+              <w:br/>
+              <w:t>04/10/2026</w:t>
             </w:r>
           </w:p>
         </w:tc>
@@ -1490,7 +1504,6 @@
               <w:left w:w="20" w:type="dxa"/>
               <w:right w:w="20" w:type="dxa"/>
             </w:tcMar>
-            <w:shd w:fill="E6F4EA"/>
           </w:tcPr>
           <w:p>
             <w:pPr>
@@ -1498,13 +1511,14 @@
             </w:pPr>
             <w:r>
               <w:rPr>
-                <w:b/>
-                <w:color w:val="0D652D"/>
-                <w:sz w:val="17"/>
+                <w:color w:val="808080"/>
+                <w:sz w:val="14"/>
               </w:rPr>
-              <w:t>✔ Đã nộp</w:t>
+              <w:t>○ Trống</w:t>
               <w:br/>
-              <w:t>(4 tệp)</w:t>
+              <w:t>(Chưa đến kỳ)</w:t>
+              <w:br/>
+              <w:t>04/10/2026</w:t>
             </w:r>
           </w:p>
         </w:tc>
@@ -1517,7 +1531,6 @@
               <w:left w:w="20" w:type="dxa"/>
               <w:right w:w="20" w:type="dxa"/>
             </w:tcMar>
-            <w:shd w:fill="E6F4EA"/>
           </w:tcPr>
           <w:p>
             <w:pPr>
@@ -1525,13 +1538,14 @@
             </w:pPr>
             <w:r>
               <w:rPr>
-                <w:b/>
-                <w:color w:val="0D652D"/>
-                <w:sz w:val="17"/>
+                <w:color w:val="808080"/>
+                <w:sz w:val="14"/>
               </w:rPr>
-              <w:t>✔ Đã nộp</w:t>
+              <w:t>○ Trống</w:t>
               <w:br/>
-              <w:t>(4 tệp)</w:t>
+              <w:t>(Chưa đến kỳ)</w:t>
+              <w:br/>
+              <w:t>04/10/2026</w:t>
             </w:r>
           </w:p>
         </w:tc>
@@ -1544,7 +1558,6 @@
               <w:left w:w="20" w:type="dxa"/>
               <w:right w:w="20" w:type="dxa"/>
             </w:tcMar>
-            <w:shd w:fill="E6F4EA"/>
           </w:tcPr>
           <w:p>
             <w:pPr>
@@ -1552,13 +1565,14 @@
             </w:pPr>
             <w:r>
               <w:rPr>
-                <w:b/>
-                <w:color w:val="0D652D"/>
-                <w:sz w:val="17"/>
+                <w:color w:val="808080"/>
+                <w:sz w:val="14"/>
               </w:rPr>
-              <w:t>✔ Đã nộp</w:t>
+              <w:t>○ Trống</w:t>
               <w:br/>
-              <w:t>(4 tệp)</w:t>
+              <w:t>(Chưa đến kỳ)</w:t>
+              <w:br/>
+              <w:t>04/10/2026</w:t>
             </w:r>
           </w:p>
         </w:tc>
@@ -1571,7 +1585,6 @@
               <w:left w:w="20" w:type="dxa"/>
               <w:right w:w="20" w:type="dxa"/>
             </w:tcMar>
-            <w:shd w:fill="E6F4EA"/>
           </w:tcPr>
           <w:p>
             <w:pPr>
@@ -1579,13 +1592,14 @@
             </w:pPr>
             <w:r>
               <w:rPr>
-                <w:b/>
-                <w:color w:val="0D652D"/>
-                <w:sz w:val="17"/>
+                <w:color w:val="808080"/>
+                <w:sz w:val="14"/>
               </w:rPr>
-              <w:t>✔ Đã nộp</w:t>
+              <w:t>○ Trống</w:t>
               <w:br/>
-              <w:t>(4 tệp)</w:t>
+              <w:t>(Chưa đến kỳ)</w:t>
+              <w:br/>
+              <w:t>04/10/2026</w:t>
             </w:r>
           </w:p>
         </w:tc>
@@ -1598,7 +1612,6 @@
               <w:left w:w="20" w:type="dxa"/>
               <w:right w:w="20" w:type="dxa"/>
             </w:tcMar>
-            <w:shd w:fill="E6F4EA"/>
           </w:tcPr>
           <w:p>
             <w:pPr>
@@ -1606,13 +1619,14 @@
             </w:pPr>
             <w:r>
               <w:rPr>
-                <w:b/>
-                <w:color w:val="0D652D"/>
-                <w:sz w:val="17"/>
+                <w:color w:val="808080"/>
+                <w:sz w:val="14"/>
               </w:rPr>
-              <w:t>✔ Đã nộp</w:t>
+              <w:t>○ Trống</w:t>
               <w:br/>
-              <w:t>(4 tệp)</w:t>
+              <w:t>(Chưa đến kỳ)</w:t>
+              <w:br/>
+              <w:t>04/10/2026</w:t>
             </w:r>
           </w:p>
         </w:tc>
@@ -1625,7 +1639,6 @@
               <w:left w:w="20" w:type="dxa"/>
               <w:right w:w="20" w:type="dxa"/>
             </w:tcMar>
-            <w:shd w:fill="E6F4EA"/>
           </w:tcPr>
           <w:p>
             <w:pPr>
@@ -1633,13 +1646,14 @@
             </w:pPr>
             <w:r>
               <w:rPr>
-                <w:b/>
-                <w:color w:val="0D652D"/>
-                <w:sz w:val="17"/>
+                <w:color w:val="808080"/>
+                <w:sz w:val="14"/>
               </w:rPr>
-              <w:t>✔ Đã nộp</w:t>
+              <w:t>○ Trống</w:t>
               <w:br/>
-              <w:t>(4 tệp)</w:t>
+              <w:t>(Chưa đến kỳ)</w:t>
+              <w:br/>
+              <w:t>04/10/2026</w:t>
             </w:r>
           </w:p>
         </w:tc>
@@ -1652,7 +1666,6 @@
               <w:left w:w="20" w:type="dxa"/>
               <w:right w:w="20" w:type="dxa"/>
             </w:tcMar>
-            <w:shd w:fill="E6F4EA"/>
           </w:tcPr>
           <w:p>
             <w:pPr>
@@ -1660,13 +1673,14 @@
             </w:pPr>
             <w:r>
               <w:rPr>
-                <w:b/>
-                <w:color w:val="0D652D"/>
-                <w:sz w:val="17"/>
+                <w:color w:val="808080"/>
+                <w:sz w:val="14"/>
               </w:rPr>
-              <w:t>✔ Đã nộp</w:t>
+              <w:t>○ Trống</w:t>
               <w:br/>
-              <w:t>(4 tệp)</w:t>
+              <w:t>(Chưa đến kỳ)</w:t>
+              <w:br/>
+              <w:t>04/10/2026</w:t>
             </w:r>
           </w:p>
         </w:tc>
@@ -1734,7 +1748,7 @@
               <w:left w:w="20" w:type="dxa"/>
               <w:right w:w="20" w:type="dxa"/>
             </w:tcMar>
-            <w:shd w:fill="E6F4EA"/>
+            <w:shd w:fill="FCE8E6"/>
           </w:tcPr>
           <w:p>
             <w:pPr>
@@ -1742,13 +1756,14 @@
             </w:pPr>
             <w:r>
               <w:rPr>
-                <w:b/>
-                <w:color w:val="0D652D"/>
-                <w:sz w:val="17"/>
+                <w:color w:val="C5221F"/>
+                <w:sz w:val="15"/>
               </w:rPr>
-              <w:t>✔ Đã nộp</w:t>
+              <w:t>❌ Chưa nộp</w:t>
               <w:br/>
-              <w:t>(6 tệp)</w:t>
+              <w:t>(0 tệp)</w:t>
+              <w:br/>
+              <w:t>04/10/2026</w:t>
             </w:r>
           </w:p>
         </w:tc>
@@ -1761,7 +1776,7 @@
               <w:left w:w="20" w:type="dxa"/>
               <w:right w:w="20" w:type="dxa"/>
             </w:tcMar>
-            <w:shd w:fill="E6F4EA"/>
+            <w:shd w:fill="FEF7E0"/>
           </w:tcPr>
           <w:p>
             <w:pPr>
@@ -1769,13 +1784,14 @@
             </w:pPr>
             <w:r>
               <w:rPr>
-                <w:b/>
-                <w:color w:val="0D652D"/>
-                <w:sz w:val="17"/>
+                <w:color w:val="B06000"/>
+                <w:sz w:val="15"/>
               </w:rPr>
-              <w:t>✔ Đã nộp</w:t>
+              <w:t>⏳ Chưa nộp</w:t>
               <w:br/>
-              <w:t>(6 tệp)</w:t>
+              <w:t>(Đang thu đợt 2)</w:t>
+              <w:br/>
+              <w:t>04/10/2026</w:t>
             </w:r>
           </w:p>
         </w:tc>
@@ -1788,7 +1804,6 @@
               <w:left w:w="20" w:type="dxa"/>
               <w:right w:w="20" w:type="dxa"/>
             </w:tcMar>
-            <w:shd w:fill="E6F4EA"/>
           </w:tcPr>
           <w:p>
             <w:pPr>
@@ -1796,13 +1811,14 @@
             </w:pPr>
             <w:r>
               <w:rPr>
-                <w:b/>
-                <w:color w:val="0D652D"/>
-                <w:sz w:val="17"/>
+                <w:color w:val="808080"/>
+                <w:sz w:val="14"/>
               </w:rPr>
-              <w:t>✔ Đã nộp</w:t>
+              <w:t>○ Trống</w:t>
               <w:br/>
-              <w:t>(6 tệp)</w:t>
+              <w:t>(Chưa đến kỳ)</w:t>
+              <w:br/>
+              <w:t>04/10/2026</w:t>
             </w:r>
           </w:p>
         </w:tc>
@@ -1815,7 +1831,6 @@
               <w:left w:w="20" w:type="dxa"/>
               <w:right w:w="20" w:type="dxa"/>
             </w:tcMar>
-            <w:shd w:fill="E6F4EA"/>
           </w:tcPr>
           <w:p>
             <w:pPr>
@@ -1823,13 +1838,14 @@
             </w:pPr>
             <w:r>
               <w:rPr>
-                <w:b/>
-                <w:color w:val="0D652D"/>
-                <w:sz w:val="17"/>
+                <w:color w:val="808080"/>
+                <w:sz w:val="14"/>
               </w:rPr>
-              <w:t>✔ Đã nộp</w:t>
+              <w:t>○ Trống</w:t>
               <w:br/>
-              <w:t>(6 tệp)</w:t>
+              <w:t>(Chưa đến kỳ)</w:t>
+              <w:br/>
+              <w:t>04/10/2026</w:t>
             </w:r>
           </w:p>
         </w:tc>
@@ -1842,7 +1858,6 @@
               <w:left w:w="20" w:type="dxa"/>
               <w:right w:w="20" w:type="dxa"/>
             </w:tcMar>
-            <w:shd w:fill="E6F4EA"/>
           </w:tcPr>
           <w:p>
             <w:pPr>
@@ -1850,13 +1865,14 @@
             </w:pPr>
             <w:r>
               <w:rPr>
-                <w:b/>
-                <w:color w:val="0D652D"/>
-                <w:sz w:val="17"/>
+                <w:color w:val="808080"/>
+                <w:sz w:val="14"/>
               </w:rPr>
-              <w:t>✔ Đã nộp</w:t>
+              <w:t>○ Trống</w:t>
               <w:br/>
-              <w:t>(6 tệp)</w:t>
+              <w:t>(Chưa đến kỳ)</w:t>
+              <w:br/>
+              <w:t>04/10/2026</w:t>
             </w:r>
           </w:p>
         </w:tc>
@@ -1869,7 +1885,6 @@
               <w:left w:w="20" w:type="dxa"/>
               <w:right w:w="20" w:type="dxa"/>
             </w:tcMar>
-            <w:shd w:fill="E6F4EA"/>
           </w:tcPr>
           <w:p>
             <w:pPr>
@@ -1877,13 +1892,14 @@
             </w:pPr>
             <w:r>
               <w:rPr>
-                <w:b/>
-                <w:color w:val="0D652D"/>
-                <w:sz w:val="17"/>
+                <w:color w:val="808080"/>
+                <w:sz w:val="14"/>
               </w:rPr>
-              <w:t>✔ Đã nộp</w:t>
+              <w:t>○ Trống</w:t>
               <w:br/>
-              <w:t>(6 tệp)</w:t>
+              <w:t>(Chưa đến kỳ)</w:t>
+              <w:br/>
+              <w:t>04/10/2026</w:t>
             </w:r>
           </w:p>
         </w:tc>
@@ -1896,7 +1912,6 @@
               <w:left w:w="20" w:type="dxa"/>
               <w:right w:w="20" w:type="dxa"/>
             </w:tcMar>
-            <w:shd w:fill="E6F4EA"/>
           </w:tcPr>
           <w:p>
             <w:pPr>
@@ -1904,13 +1919,14 @@
             </w:pPr>
             <w:r>
               <w:rPr>
-                <w:b/>
-                <w:color w:val="0D652D"/>
-                <w:sz w:val="17"/>
+                <w:color w:val="808080"/>
+                <w:sz w:val="14"/>
               </w:rPr>
-              <w:t>✔ Đã nộp</w:t>
+              <w:t>○ Trống</w:t>
               <w:br/>
-              <w:t>(6 tệp)</w:t>
+              <w:t>(Chưa đến kỳ)</w:t>
+              <w:br/>
+              <w:t>04/10/2026</w:t>
             </w:r>
           </w:p>
         </w:tc>
@@ -1923,7 +1939,6 @@
               <w:left w:w="20" w:type="dxa"/>
               <w:right w:w="20" w:type="dxa"/>
             </w:tcMar>
-            <w:shd w:fill="E6F4EA"/>
           </w:tcPr>
           <w:p>
             <w:pPr>
@@ -1931,13 +1946,14 @@
             </w:pPr>
             <w:r>
               <w:rPr>
-                <w:b/>
-                <w:color w:val="0D652D"/>
-                <w:sz w:val="17"/>
+                <w:color w:val="808080"/>
+                <w:sz w:val="14"/>
               </w:rPr>
-              <w:t>✔ Đã nộp</w:t>
+              <w:t>○ Trống</w:t>
               <w:br/>
-              <w:t>(6 tệp)</w:t>
+              <w:t>(Chưa đến kỳ)</w:t>
+              <w:br/>
+              <w:t>04/10/2026</w:t>
             </w:r>
           </w:p>
         </w:tc>
@@ -1950,7 +1966,6 @@
               <w:left w:w="20" w:type="dxa"/>
               <w:right w:w="20" w:type="dxa"/>
             </w:tcMar>
-            <w:shd w:fill="E6F4EA"/>
           </w:tcPr>
           <w:p>
             <w:pPr>
@@ -1958,13 +1973,14 @@
             </w:pPr>
             <w:r>
               <w:rPr>
-                <w:b/>
-                <w:color w:val="0D652D"/>
-                <w:sz w:val="17"/>
+                <w:color w:val="808080"/>
+                <w:sz w:val="14"/>
               </w:rPr>
-              <w:t>✔ Đã nộp</w:t>
+              <w:t>○ Trống</w:t>
               <w:br/>
-              <w:t>(6 tệp)</w:t>
+              <w:t>(Chưa đến kỳ)</w:t>
+              <w:br/>
+              <w:t>04/10/2026</w:t>
             </w:r>
           </w:p>
         </w:tc>
@@ -2042,11 +2058,13 @@
               <w:rPr>
                 <w:b/>
                 <w:color w:val="0D652D"/>
-                <w:sz w:val="17"/>
+                <w:sz w:val="16"/>
               </w:rPr>
               <w:t>✔ Đã nộp</w:t>
               <w:br/>
               <w:t>(4 tệp)</w:t>
+              <w:br/>
+              <w:t>04/10/2026</w:t>
             </w:r>
           </w:p>
         </w:tc>
@@ -2069,11 +2087,13 @@
               <w:rPr>
                 <w:b/>
                 <w:color w:val="0D652D"/>
-                <w:sz w:val="17"/>
+                <w:sz w:val="16"/>
               </w:rPr>
               <w:t>✔ Đã nộp</w:t>
               <w:br/>
-              <w:t>(4 tệp)</w:t>
+              <w:t>(5 tệp)</w:t>
+              <w:br/>
+              <w:t>04/10/2026</w:t>
             </w:r>
           </w:p>
         </w:tc>
@@ -2086,7 +2106,6 @@
               <w:left w:w="20" w:type="dxa"/>
               <w:right w:w="20" w:type="dxa"/>
             </w:tcMar>
-            <w:shd w:fill="E6F4EA"/>
           </w:tcPr>
           <w:p>
             <w:pPr>
@@ -2094,13 +2113,14 @@
             </w:pPr>
             <w:r>
               <w:rPr>
-                <w:b/>
-                <w:color w:val="0D652D"/>
-                <w:sz w:val="17"/>
+                <w:color w:val="808080"/>
+                <w:sz w:val="14"/>
               </w:rPr>
-              <w:t>✔ Đã nộp</w:t>
+              <w:t>○ Trống</w:t>
               <w:br/>
-              <w:t>(4 tệp)</w:t>
+              <w:t>(Chưa đến kỳ)</w:t>
+              <w:br/>
+              <w:t>04/10/2026</w:t>
             </w:r>
           </w:p>
         </w:tc>
@@ -2113,7 +2133,6 @@
               <w:left w:w="20" w:type="dxa"/>
               <w:right w:w="20" w:type="dxa"/>
             </w:tcMar>
-            <w:shd w:fill="E6F4EA"/>
           </w:tcPr>
           <w:p>
             <w:pPr>
@@ -2121,13 +2140,14 @@
             </w:pPr>
             <w:r>
               <w:rPr>
-                <w:b/>
-                <w:color w:val="0D652D"/>
-                <w:sz w:val="17"/>
+                <w:color w:val="808080"/>
+                <w:sz w:val="14"/>
               </w:rPr>
-              <w:t>✔ Đã nộp</w:t>
+              <w:t>○ Trống</w:t>
               <w:br/>
-              <w:t>(4 tệp)</w:t>
+              <w:t>(Chưa đến kỳ)</w:t>
+              <w:br/>
+              <w:t>04/10/2026</w:t>
             </w:r>
           </w:p>
         </w:tc>
@@ -2140,7 +2160,6 @@
               <w:left w:w="20" w:type="dxa"/>
               <w:right w:w="20" w:type="dxa"/>
             </w:tcMar>
-            <w:shd w:fill="E6F4EA"/>
           </w:tcPr>
           <w:p>
             <w:pPr>
@@ -2148,13 +2167,14 @@
             </w:pPr>
             <w:r>
               <w:rPr>
-                <w:b/>
-                <w:color w:val="0D652D"/>
-                <w:sz w:val="17"/>
+                <w:color w:val="808080"/>
+                <w:sz w:val="14"/>
               </w:rPr>
-              <w:t>✔ Đã nộp</w:t>
+              <w:t>○ Trống</w:t>
               <w:br/>
-              <w:t>(4 tệp)</w:t>
+              <w:t>(Chưa đến kỳ)</w:t>
+              <w:br/>
+              <w:t>04/10/2026</w:t>
             </w:r>
           </w:p>
         </w:tc>
@@ -2167,7 +2187,6 @@
               <w:left w:w="20" w:type="dxa"/>
               <w:right w:w="20" w:type="dxa"/>
             </w:tcMar>
-            <w:shd w:fill="E6F4EA"/>
           </w:tcPr>
           <w:p>
             <w:pPr>
@@ -2175,13 +2194,14 @@
             </w:pPr>
             <w:r>
               <w:rPr>
-                <w:b/>
-                <w:color w:val="0D652D"/>
-                <w:sz w:val="17"/>
+                <w:color w:val="808080"/>
+                <w:sz w:val="14"/>
               </w:rPr>
-              <w:t>✔ Đã nộp</w:t>
+              <w:t>○ Trống</w:t>
               <w:br/>
-              <w:t>(4 tệp)</w:t>
+              <w:t>(Chưa đến kỳ)</w:t>
+              <w:br/>
+              <w:t>04/10/2026</w:t>
             </w:r>
           </w:p>
         </w:tc>
@@ -2194,7 +2214,6 @@
               <w:left w:w="20" w:type="dxa"/>
               <w:right w:w="20" w:type="dxa"/>
             </w:tcMar>
-            <w:shd w:fill="E6F4EA"/>
           </w:tcPr>
           <w:p>
             <w:pPr>
@@ -2202,13 +2221,14 @@
             </w:pPr>
             <w:r>
               <w:rPr>
-                <w:b/>
-                <w:color w:val="0D652D"/>
-                <w:sz w:val="17"/>
+                <w:color w:val="808080"/>
+                <w:sz w:val="14"/>
               </w:rPr>
-              <w:t>✔ Đã nộp</w:t>
+              <w:t>○ Trống</w:t>
               <w:br/>
-              <w:t>(4 tệp)</w:t>
+              <w:t>(Chưa đến kỳ)</w:t>
+              <w:br/>
+              <w:t>04/10/2026</w:t>
             </w:r>
           </w:p>
         </w:tc>
@@ -2221,7 +2241,6 @@
               <w:left w:w="20" w:type="dxa"/>
               <w:right w:w="20" w:type="dxa"/>
             </w:tcMar>
-            <w:shd w:fill="E6F4EA"/>
           </w:tcPr>
           <w:p>
             <w:pPr>
@@ -2229,13 +2248,14 @@
             </w:pPr>
             <w:r>
               <w:rPr>
-                <w:b/>
-                <w:color w:val="0D652D"/>
-                <w:sz w:val="17"/>
+                <w:color w:val="808080"/>
+                <w:sz w:val="14"/>
               </w:rPr>
-              <w:t>✔ Đã nộp</w:t>
+              <w:t>○ Trống</w:t>
               <w:br/>
-              <w:t>(4 tệp)</w:t>
+              <w:t>(Chưa đến kỳ)</w:t>
+              <w:br/>
+              <w:t>04/10/2026</w:t>
             </w:r>
           </w:p>
         </w:tc>
@@ -2248,7 +2268,6 @@
               <w:left w:w="20" w:type="dxa"/>
               <w:right w:w="20" w:type="dxa"/>
             </w:tcMar>
-            <w:shd w:fill="E6F4EA"/>
           </w:tcPr>
           <w:p>
             <w:pPr>
@@ -2256,13 +2275,14 @@
             </w:pPr>
             <w:r>
               <w:rPr>
-                <w:b/>
-                <w:color w:val="0D652D"/>
-                <w:sz w:val="17"/>
+                <w:color w:val="808080"/>
+                <w:sz w:val="14"/>
               </w:rPr>
-              <w:t>✔ Đã nộp</w:t>
+              <w:t>○ Trống</w:t>
               <w:br/>
-              <w:t>(4 tệp)</w:t>
+              <w:t>(Chưa đến kỳ)</w:t>
+              <w:br/>
+              <w:t>04/10/2026</w:t>
             </w:r>
           </w:p>
         </w:tc>
@@ -2340,11 +2360,13 @@
               <w:rPr>
                 <w:b/>
                 <w:color w:val="0D652D"/>
-                <w:sz w:val="17"/>
+                <w:sz w:val="16"/>
               </w:rPr>
               <w:t>✔ Đã nộp</w:t>
               <w:br/>
-              <w:t>(8 tệp)</w:t>
+              <w:t>(3 tệp)</w:t>
+              <w:br/>
+              <w:t>04/10/2026</w:t>
             </w:r>
           </w:p>
         </w:tc>
@@ -2357,7 +2379,7 @@
               <w:left w:w="20" w:type="dxa"/>
               <w:right w:w="20" w:type="dxa"/>
             </w:tcMar>
-            <w:shd w:fill="E6F4EA"/>
+            <w:shd w:fill="FEF7E0"/>
           </w:tcPr>
           <w:p>
             <w:pPr>
@@ -2365,13 +2387,14 @@
             </w:pPr>
             <w:r>
               <w:rPr>
-                <w:b/>
-                <w:color w:val="0D652D"/>
-                <w:sz w:val="17"/>
+                <w:color w:val="B06000"/>
+                <w:sz w:val="15"/>
               </w:rPr>
-              <w:t>✔ Đã nộp</w:t>
+              <w:t>⏳ Chưa nộp</w:t>
               <w:br/>
-              <w:t>(8 tệp)</w:t>
+              <w:t>(Đang thu đợt 2)</w:t>
+              <w:br/>
+              <w:t>04/10/2026</w:t>
             </w:r>
           </w:p>
         </w:tc>
@@ -2384,7 +2407,6 @@
               <w:left w:w="20" w:type="dxa"/>
               <w:right w:w="20" w:type="dxa"/>
             </w:tcMar>
-            <w:shd w:fill="E6F4EA"/>
           </w:tcPr>
           <w:p>
             <w:pPr>
@@ -2392,13 +2414,14 @@
             </w:pPr>
             <w:r>
               <w:rPr>
-                <w:b/>
-                <w:color w:val="0D652D"/>
-                <w:sz w:val="17"/>
+                <w:color w:val="808080"/>
+                <w:sz w:val="14"/>
               </w:rPr>
-              <w:t>✔ Đã nộp</w:t>
+              <w:t>○ Trống</w:t>
               <w:br/>
-              <w:t>(8 tệp)</w:t>
+              <w:t>(Chưa đến kỳ)</w:t>
+              <w:br/>
+              <w:t>04/10/2026</w:t>
             </w:r>
           </w:p>
         </w:tc>
@@ -2411,7 +2434,6 @@
               <w:left w:w="20" w:type="dxa"/>
               <w:right w:w="20" w:type="dxa"/>
             </w:tcMar>
-            <w:shd w:fill="E6F4EA"/>
           </w:tcPr>
           <w:p>
             <w:pPr>
@@ -2419,13 +2441,14 @@
             </w:pPr>
             <w:r>
               <w:rPr>
-                <w:b/>
-                <w:color w:val="0D652D"/>
-                <w:sz w:val="17"/>
+                <w:color w:val="808080"/>
+                <w:sz w:val="14"/>
               </w:rPr>
-              <w:t>✔ Đã nộp</w:t>
+              <w:t>○ Trống</w:t>
               <w:br/>
-              <w:t>(8 tệp)</w:t>
+              <w:t>(Chưa đến kỳ)</w:t>
+              <w:br/>
+              <w:t>04/10/2026</w:t>
             </w:r>
           </w:p>
         </w:tc>
@@ -2438,7 +2461,6 @@
               <w:left w:w="20" w:type="dxa"/>
               <w:right w:w="20" w:type="dxa"/>
             </w:tcMar>
-            <w:shd w:fill="E6F4EA"/>
           </w:tcPr>
           <w:p>
             <w:pPr>
@@ -2446,13 +2468,14 @@
             </w:pPr>
             <w:r>
               <w:rPr>
-                <w:b/>
-                <w:color w:val="0D652D"/>
-                <w:sz w:val="17"/>
+                <w:color w:val="808080"/>
+                <w:sz w:val="14"/>
               </w:rPr>
-              <w:t>✔ Đã nộp</w:t>
+              <w:t>○ Trống</w:t>
               <w:br/>
-              <w:t>(8 tệp)</w:t>
+              <w:t>(Chưa đến kỳ)</w:t>
+              <w:br/>
+              <w:t>04/10/2026</w:t>
             </w:r>
           </w:p>
         </w:tc>
@@ -2465,7 +2488,6 @@
               <w:left w:w="20" w:type="dxa"/>
               <w:right w:w="20" w:type="dxa"/>
             </w:tcMar>
-            <w:shd w:fill="E6F4EA"/>
           </w:tcPr>
           <w:p>
             <w:pPr>
@@ -2473,13 +2495,14 @@
             </w:pPr>
             <w:r>
               <w:rPr>
-                <w:b/>
-                <w:color w:val="0D652D"/>
-                <w:sz w:val="17"/>
+                <w:color w:val="808080"/>
+                <w:sz w:val="14"/>
               </w:rPr>
-              <w:t>✔ Đã nộp</w:t>
+              <w:t>○ Trống</w:t>
               <w:br/>
-              <w:t>(8 tệp)</w:t>
+              <w:t>(Chưa đến kỳ)</w:t>
+              <w:br/>
+              <w:t>04/10/2026</w:t>
             </w:r>
           </w:p>
         </w:tc>
@@ -2492,7 +2515,6 @@
               <w:left w:w="20" w:type="dxa"/>
               <w:right w:w="20" w:type="dxa"/>
             </w:tcMar>
-            <w:shd w:fill="E6F4EA"/>
           </w:tcPr>
           <w:p>
             <w:pPr>
@@ -2500,13 +2522,14 @@
             </w:pPr>
             <w:r>
               <w:rPr>
-                <w:b/>
-                <w:color w:val="0D652D"/>
-                <w:sz w:val="17"/>
+                <w:color w:val="808080"/>
+                <w:sz w:val="14"/>
               </w:rPr>
-              <w:t>✔ Đã nộp</w:t>
+              <w:t>○ Trống</w:t>
               <w:br/>
-              <w:t>(8 tệp)</w:t>
+              <w:t>(Chưa đến kỳ)</w:t>
+              <w:br/>
+              <w:t>04/10/2026</w:t>
             </w:r>
           </w:p>
         </w:tc>
@@ -2519,7 +2542,6 @@
               <w:left w:w="20" w:type="dxa"/>
               <w:right w:w="20" w:type="dxa"/>
             </w:tcMar>
-            <w:shd w:fill="E6F4EA"/>
           </w:tcPr>
           <w:p>
             <w:pPr>
@@ -2527,13 +2549,14 @@
             </w:pPr>
             <w:r>
               <w:rPr>
-                <w:b/>
-                <w:color w:val="0D652D"/>
-                <w:sz w:val="17"/>
+                <w:color w:val="808080"/>
+                <w:sz w:val="14"/>
               </w:rPr>
-              <w:t>✔ Đã nộp</w:t>
+              <w:t>○ Trống</w:t>
               <w:br/>
-              <w:t>(8 tệp)</w:t>
+              <w:t>(Chưa đến kỳ)</w:t>
+              <w:br/>
+              <w:t>04/10/2026</w:t>
             </w:r>
           </w:p>
         </w:tc>
@@ -2546,7 +2569,6 @@
               <w:left w:w="20" w:type="dxa"/>
               <w:right w:w="20" w:type="dxa"/>
             </w:tcMar>
-            <w:shd w:fill="E6F4EA"/>
           </w:tcPr>
           <w:p>
             <w:pPr>
@@ -2554,13 +2576,14 @@
             </w:pPr>
             <w:r>
               <w:rPr>
-                <w:b/>
-                <w:color w:val="0D652D"/>
-                <w:sz w:val="17"/>
+                <w:color w:val="808080"/>
+                <w:sz w:val="14"/>
               </w:rPr>
-              <w:t>✔ Đã nộp</w:t>
+              <w:t>○ Trống</w:t>
               <w:br/>
-              <w:t>(8 tệp)</w:t>
+              <w:t>(Chưa đến kỳ)</w:t>
+              <w:br/>
+              <w:t>04/10/2026</w:t>
             </w:r>
           </w:p>
         </w:tc>
@@ -2615,7 +2638,7 @@
                 <w:i/>
                 <w:sz w:val="17"/>
               </w:rPr>
-              <w:t>(Hóa 9, KHTN 7, Toán 9)</w:t>
+              <w:t>(Hóa 9, KHTN 7)</w:t>
             </w:r>
           </w:p>
         </w:tc>
@@ -2628,7 +2651,7 @@
               <w:left w:w="20" w:type="dxa"/>
               <w:right w:w="20" w:type="dxa"/>
             </w:tcMar>
-            <w:shd w:fill="E6F4EA"/>
+            <w:shd w:fill="FCE8E6"/>
           </w:tcPr>
           <w:p>
             <w:pPr>
@@ -2636,13 +2659,14 @@
             </w:pPr>
             <w:r>
               <w:rPr>
-                <w:b/>
-                <w:color w:val="0D652D"/>
-                <w:sz w:val="17"/>
+                <w:color w:val="C5221F"/>
+                <w:sz w:val="15"/>
               </w:rPr>
-              <w:t>✔ Đã nộp</w:t>
+              <w:t>❌ Chưa nộp</w:t>
               <w:br/>
-              <w:t>(6 tệp)</w:t>
+              <w:t>(0 tệp)</w:t>
+              <w:br/>
+              <w:t>04/10/2026</w:t>
             </w:r>
           </w:p>
         </w:tc>
@@ -2655,7 +2679,7 @@
               <w:left w:w="20" w:type="dxa"/>
               <w:right w:w="20" w:type="dxa"/>
             </w:tcMar>
-            <w:shd w:fill="E6F4EA"/>
+            <w:shd w:fill="FEF7E0"/>
           </w:tcPr>
           <w:p>
             <w:pPr>
@@ -2663,13 +2687,14 @@
             </w:pPr>
             <w:r>
               <w:rPr>
-                <w:b/>
-                <w:color w:val="0D652D"/>
-                <w:sz w:val="17"/>
+                <w:color w:val="B06000"/>
+                <w:sz w:val="15"/>
               </w:rPr>
-              <w:t>✔ Đã nộp</w:t>
+              <w:t>⏳ Chưa nộp</w:t>
               <w:br/>
-              <w:t>(6 tệp)</w:t>
+              <w:t>(Đang thu đợt 2)</w:t>
+              <w:br/>
+              <w:t>04/10/2026</w:t>
             </w:r>
           </w:p>
         </w:tc>
@@ -2682,7 +2707,6 @@
               <w:left w:w="20" w:type="dxa"/>
               <w:right w:w="20" w:type="dxa"/>
             </w:tcMar>
-            <w:shd w:fill="E6F4EA"/>
           </w:tcPr>
           <w:p>
             <w:pPr>
@@ -2690,13 +2714,14 @@
             </w:pPr>
             <w:r>
               <w:rPr>
-                <w:b/>
-                <w:color w:val="0D652D"/>
-                <w:sz w:val="17"/>
+                <w:color w:val="808080"/>
+                <w:sz w:val="14"/>
               </w:rPr>
-              <w:t>✔ Đã nộp</w:t>
+              <w:t>○ Trống</w:t>
               <w:br/>
-              <w:t>(6 tệp)</w:t>
+              <w:t>(Chưa đến kỳ)</w:t>
+              <w:br/>
+              <w:t>04/10/2026</w:t>
             </w:r>
           </w:p>
         </w:tc>
@@ -2709,7 +2734,6 @@
               <w:left w:w="20" w:type="dxa"/>
               <w:right w:w="20" w:type="dxa"/>
             </w:tcMar>
-            <w:shd w:fill="E6F4EA"/>
           </w:tcPr>
           <w:p>
             <w:pPr>
@@ -2717,13 +2741,14 @@
             </w:pPr>
             <w:r>
               <w:rPr>
-                <w:b/>
-                <w:color w:val="0D652D"/>
-                <w:sz w:val="17"/>
+                <w:color w:val="808080"/>
+                <w:sz w:val="14"/>
               </w:rPr>
-              <w:t>✔ Đã nộp</w:t>
+              <w:t>○ Trống</w:t>
               <w:br/>
-              <w:t>(6 tệp)</w:t>
+              <w:t>(Chưa đến kỳ)</w:t>
+              <w:br/>
+              <w:t>04/10/2026</w:t>
             </w:r>
           </w:p>
         </w:tc>
@@ -2736,7 +2761,6 @@
               <w:left w:w="20" w:type="dxa"/>
               <w:right w:w="20" w:type="dxa"/>
             </w:tcMar>
-            <w:shd w:fill="E6F4EA"/>
           </w:tcPr>
           <w:p>
             <w:pPr>
@@ -2744,13 +2768,14 @@
             </w:pPr>
             <w:r>
               <w:rPr>
-                <w:b/>
-                <w:color w:val="0D652D"/>
-                <w:sz w:val="17"/>
+                <w:color w:val="808080"/>
+                <w:sz w:val="14"/>
               </w:rPr>
-              <w:t>✔ Đã nộp</w:t>
+              <w:t>○ Trống</w:t>
               <w:br/>
-              <w:t>(6 tệp)</w:t>
+              <w:t>(Chưa đến kỳ)</w:t>
+              <w:br/>
+              <w:t>04/10/2026</w:t>
             </w:r>
           </w:p>
         </w:tc>
@@ -2763,7 +2788,6 @@
               <w:left w:w="20" w:type="dxa"/>
               <w:right w:w="20" w:type="dxa"/>
             </w:tcMar>
-            <w:shd w:fill="E6F4EA"/>
           </w:tcPr>
           <w:p>
             <w:pPr>
@@ -2771,13 +2795,14 @@
             </w:pPr>
             <w:r>
               <w:rPr>
-                <w:b/>
-                <w:color w:val="0D652D"/>
-                <w:sz w:val="17"/>
+                <w:color w:val="808080"/>
+                <w:sz w:val="14"/>
               </w:rPr>
-              <w:t>✔ Đã nộp</w:t>
+              <w:t>○ Trống</w:t>
               <w:br/>
-              <w:t>(6 tệp)</w:t>
+              <w:t>(Chưa đến kỳ)</w:t>
+              <w:br/>
+              <w:t>04/10/2026</w:t>
             </w:r>
           </w:p>
         </w:tc>
@@ -2790,7 +2815,6 @@
               <w:left w:w="20" w:type="dxa"/>
               <w:right w:w="20" w:type="dxa"/>
             </w:tcMar>
-            <w:shd w:fill="E6F4EA"/>
           </w:tcPr>
           <w:p>
             <w:pPr>
@@ -2798,13 +2822,14 @@
             </w:pPr>
             <w:r>
               <w:rPr>
-                <w:b/>
-                <w:color w:val="0D652D"/>
-                <w:sz w:val="17"/>
+                <w:color w:val="808080"/>
+                <w:sz w:val="14"/>
               </w:rPr>
-              <w:t>✔ Đã nộp</w:t>
+              <w:t>○ Trống</w:t>
               <w:br/>
-              <w:t>(6 tệp)</w:t>
+              <w:t>(Chưa đến kỳ)</w:t>
+              <w:br/>
+              <w:t>04/10/2026</w:t>
             </w:r>
           </w:p>
         </w:tc>
@@ -2817,7 +2842,6 @@
               <w:left w:w="20" w:type="dxa"/>
               <w:right w:w="20" w:type="dxa"/>
             </w:tcMar>
-            <w:shd w:fill="E6F4EA"/>
           </w:tcPr>
           <w:p>
             <w:pPr>
@@ -2825,13 +2849,14 @@
             </w:pPr>
             <w:r>
               <w:rPr>
-                <w:b/>
-                <w:color w:val="0D652D"/>
-                <w:sz w:val="17"/>
+                <w:color w:val="808080"/>
+                <w:sz w:val="14"/>
               </w:rPr>
-              <w:t>✔ Đã nộp</w:t>
+              <w:t>○ Trống</w:t>
               <w:br/>
-              <w:t>(6 tệp)</w:t>
+              <w:t>(Chưa đến kỳ)</w:t>
+              <w:br/>
+              <w:t>04/10/2026</w:t>
             </w:r>
           </w:p>
         </w:tc>
@@ -2844,7 +2869,6 @@
               <w:left w:w="20" w:type="dxa"/>
               <w:right w:w="20" w:type="dxa"/>
             </w:tcMar>
-            <w:shd w:fill="E6F4EA"/>
           </w:tcPr>
           <w:p>
             <w:pPr>
@@ -2852,13 +2876,14 @@
             </w:pPr>
             <w:r>
               <w:rPr>
-                <w:b/>
-                <w:color w:val="0D652D"/>
-                <w:sz w:val="17"/>
+                <w:color w:val="808080"/>
+                <w:sz w:val="14"/>
               </w:rPr>
-              <w:t>✔ Đã nộp</w:t>
+              <w:t>○ Trống</w:t>
               <w:br/>
-              <w:t>(6 tệp)</w:t>
+              <w:t>(Chưa đến kỳ)</w:t>
+              <w:br/>
+              <w:t>04/10/2026</w:t>
             </w:r>
           </w:p>
         </w:tc>

</xml_diff>

<commit_message>
fix(drive-sync): Cap nhat chinh xac tien do nop giao an Google Drive cho Co Thuy va 8 giao vien
</commit_message>
<xml_diff>
--- a/data/corrected/BAO_CAO_CHI_TIET_TIEN_DO_9_CHU_KY_TUAN_GOOGLE_DRIVE.docx
+++ b/data/corrected/BAO_CAO_CHI_TIET_TIEN_DO_9_CHU_KY_TUAN_GOOGLE_DRIVE.docx
@@ -558,7 +558,7 @@
               <w:br/>
               <w:t>(9 tệp)</w:t>
               <w:br/>
-              <w:t>04/10/2026</w:t>
+              <w:t>08/10/2026</w:t>
             </w:r>
           </w:p>
         </w:tc>
@@ -587,7 +587,7 @@
               <w:br/>
               <w:t>(8 tệp)</w:t>
               <w:br/>
-              <w:t>04/10/2026</w:t>
+              <w:t>08/10/2026</w:t>
             </w:r>
           </w:p>
         </w:tc>
@@ -614,7 +614,7 @@
               <w:br/>
               <w:t>(Chưa đến kỳ)</w:t>
               <w:br/>
-              <w:t>04/10/2026</w:t>
+              <w:t>08/10/2026</w:t>
             </w:r>
           </w:p>
         </w:tc>
@@ -641,7 +641,7 @@
               <w:br/>
               <w:t>(Chưa đến kỳ)</w:t>
               <w:br/>
-              <w:t>04/10/2026</w:t>
+              <w:t>08/10/2026</w:t>
             </w:r>
           </w:p>
         </w:tc>
@@ -668,7 +668,7 @@
               <w:br/>
               <w:t>(Chưa đến kỳ)</w:t>
               <w:br/>
-              <w:t>04/10/2026</w:t>
+              <w:t>08/10/2026</w:t>
             </w:r>
           </w:p>
         </w:tc>
@@ -695,7 +695,7 @@
               <w:br/>
               <w:t>(Chưa đến kỳ)</w:t>
               <w:br/>
-              <w:t>04/10/2026</w:t>
+              <w:t>08/10/2026</w:t>
             </w:r>
           </w:p>
         </w:tc>
@@ -722,7 +722,7 @@
               <w:br/>
               <w:t>(Chưa đến kỳ)</w:t>
               <w:br/>
-              <w:t>04/10/2026</w:t>
+              <w:t>08/10/2026</w:t>
             </w:r>
           </w:p>
         </w:tc>
@@ -749,7 +749,7 @@
               <w:br/>
               <w:t>(Chưa đến kỳ)</w:t>
               <w:br/>
-              <w:t>04/10/2026</w:t>
+              <w:t>08/10/2026</w:t>
             </w:r>
           </w:p>
         </w:tc>
@@ -776,7 +776,7 @@
               <w:br/>
               <w:t>(Chưa đến kỳ)</w:t>
               <w:br/>
-              <w:t>04/10/2026</w:t>
+              <w:t>08/10/2026</w:t>
             </w:r>
           </w:p>
         </w:tc>
@@ -860,7 +860,7 @@
               <w:br/>
               <w:t>(15 tệp)</w:t>
               <w:br/>
-              <w:t>04/10/2026</w:t>
+              <w:t>08/10/2026</w:t>
             </w:r>
           </w:p>
         </w:tc>
@@ -889,7 +889,7 @@
               <w:br/>
               <w:t>(20 tệp)</w:t>
               <w:br/>
-              <w:t>04/10/2026</w:t>
+              <w:t>08/10/2026</w:t>
             </w:r>
           </w:p>
         </w:tc>
@@ -916,7 +916,7 @@
               <w:br/>
               <w:t>(Chưa đến kỳ)</w:t>
               <w:br/>
-              <w:t>04/10/2026</w:t>
+              <w:t>08/10/2026</w:t>
             </w:r>
           </w:p>
         </w:tc>
@@ -943,7 +943,7 @@
               <w:br/>
               <w:t>(Chưa đến kỳ)</w:t>
               <w:br/>
-              <w:t>04/10/2026</w:t>
+              <w:t>08/10/2026</w:t>
             </w:r>
           </w:p>
         </w:tc>
@@ -970,7 +970,7 @@
               <w:br/>
               <w:t>(Chưa đến kỳ)</w:t>
               <w:br/>
-              <w:t>04/10/2026</w:t>
+              <w:t>08/10/2026</w:t>
             </w:r>
           </w:p>
         </w:tc>
@@ -997,7 +997,7 @@
               <w:br/>
               <w:t>(Chưa đến kỳ)</w:t>
               <w:br/>
-              <w:t>04/10/2026</w:t>
+              <w:t>08/10/2026</w:t>
             </w:r>
           </w:p>
         </w:tc>
@@ -1024,7 +1024,7 @@
               <w:br/>
               <w:t>(Chưa đến kỳ)</w:t>
               <w:br/>
-              <w:t>04/10/2026</w:t>
+              <w:t>08/10/2026</w:t>
             </w:r>
           </w:p>
         </w:tc>
@@ -1051,7 +1051,7 @@
               <w:br/>
               <w:t>(Chưa đến kỳ)</w:t>
               <w:br/>
-              <w:t>04/10/2026</w:t>
+              <w:t>08/10/2026</w:t>
             </w:r>
           </w:p>
         </w:tc>
@@ -1078,7 +1078,7 @@
               <w:br/>
               <w:t>(Chưa đến kỳ)</w:t>
               <w:br/>
-              <w:t>04/10/2026</w:t>
+              <w:t>08/10/2026</w:t>
             </w:r>
           </w:p>
         </w:tc>
@@ -1162,7 +1162,7 @@
               <w:br/>
               <w:t>(13 tệp)</w:t>
               <w:br/>
-              <w:t>04/10/2026</w:t>
+              <w:t>08/10/2026</w:t>
             </w:r>
           </w:p>
         </w:tc>
@@ -1189,9 +1189,9 @@
               </w:rPr>
               <w:t>✔ Đã nộp</w:t>
               <w:br/>
-              <w:t>(8 tệp)</w:t>
+              <w:t>(12 tệp)</w:t>
               <w:br/>
-              <w:t>04/10/2026</w:t>
+              <w:t>08/10/2026</w:t>
             </w:r>
           </w:p>
         </w:tc>
@@ -1218,7 +1218,7 @@
               <w:br/>
               <w:t>(Chưa đến kỳ)</w:t>
               <w:br/>
-              <w:t>04/10/2026</w:t>
+              <w:t>08/10/2026</w:t>
             </w:r>
           </w:p>
         </w:tc>
@@ -1245,7 +1245,7 @@
               <w:br/>
               <w:t>(Chưa đến kỳ)</w:t>
               <w:br/>
-              <w:t>04/10/2026</w:t>
+              <w:t>08/10/2026</w:t>
             </w:r>
           </w:p>
         </w:tc>
@@ -1272,7 +1272,7 @@
               <w:br/>
               <w:t>(Chưa đến kỳ)</w:t>
               <w:br/>
-              <w:t>04/10/2026</w:t>
+              <w:t>08/10/2026</w:t>
             </w:r>
           </w:p>
         </w:tc>
@@ -1299,7 +1299,7 @@
               <w:br/>
               <w:t>(Chưa đến kỳ)</w:t>
               <w:br/>
-              <w:t>04/10/2026</w:t>
+              <w:t>08/10/2026</w:t>
             </w:r>
           </w:p>
         </w:tc>
@@ -1326,7 +1326,7 @@
               <w:br/>
               <w:t>(Chưa đến kỳ)</w:t>
               <w:br/>
-              <w:t>04/10/2026</w:t>
+              <w:t>08/10/2026</w:t>
             </w:r>
           </w:p>
         </w:tc>
@@ -1353,7 +1353,7 @@
               <w:br/>
               <w:t>(Chưa đến kỳ)</w:t>
               <w:br/>
-              <w:t>04/10/2026</w:t>
+              <w:t>08/10/2026</w:t>
             </w:r>
           </w:p>
         </w:tc>
@@ -1380,7 +1380,7 @@
               <w:br/>
               <w:t>(Chưa đến kỳ)</w:t>
               <w:br/>
-              <w:t>04/10/2026</w:t>
+              <w:t>08/10/2026</w:t>
             </w:r>
           </w:p>
         </w:tc>
@@ -1448,7 +1448,7 @@
               <w:left w:w="20" w:type="dxa"/>
               <w:right w:w="20" w:type="dxa"/>
             </w:tcMar>
-            <w:shd w:fill="FCE8E6"/>
+            <w:shd w:fill="E6F4EA"/>
           </w:tcPr>
           <w:p>
             <w:pPr>
@@ -1456,14 +1456,15 @@
             </w:pPr>
             <w:r>
               <w:rPr>
-                <w:color w:val="C5221F"/>
-                <w:sz w:val="15"/>
+                <w:b/>
+                <w:color w:val="0D652D"/>
+                <w:sz w:val="16"/>
               </w:rPr>
-              <w:t>❌ Chưa nộp</w:t>
+              <w:t>✔ Đã nộp</w:t>
               <w:br/>
-              <w:t>(0 tệp)</w:t>
+              <w:t>(7 tệp)</w:t>
               <w:br/>
-              <w:t>04/10/2026</w:t>
+              <w:t>08/10/2026</w:t>
             </w:r>
           </w:p>
         </w:tc>
@@ -1476,7 +1477,7 @@
               <w:left w:w="20" w:type="dxa"/>
               <w:right w:w="20" w:type="dxa"/>
             </w:tcMar>
-            <w:shd w:fill="FEF7E0"/>
+            <w:shd w:fill="E6F4EA"/>
           </w:tcPr>
           <w:p>
             <w:pPr>
@@ -1484,14 +1485,15 @@
             </w:pPr>
             <w:r>
               <w:rPr>
-                <w:color w:val="B06000"/>
-                <w:sz w:val="15"/>
+                <w:b/>
+                <w:color w:val="0D652D"/>
+                <w:sz w:val="16"/>
               </w:rPr>
-              <w:t>⏳ Chưa nộp</w:t>
+              <w:t>✔ Đã nộp</w:t>
               <w:br/>
-              <w:t>(Đang thu đợt 2)</w:t>
+              <w:t>(7 tệp)</w:t>
               <w:br/>
-              <w:t>04/10/2026</w:t>
+              <w:t>08/10/2026</w:t>
             </w:r>
           </w:p>
         </w:tc>
@@ -1518,7 +1520,7 @@
               <w:br/>
               <w:t>(Chưa đến kỳ)</w:t>
               <w:br/>
-              <w:t>04/10/2026</w:t>
+              <w:t>08/10/2026</w:t>
             </w:r>
           </w:p>
         </w:tc>
@@ -1545,7 +1547,7 @@
               <w:br/>
               <w:t>(Chưa đến kỳ)</w:t>
               <w:br/>
-              <w:t>04/10/2026</w:t>
+              <w:t>08/10/2026</w:t>
             </w:r>
           </w:p>
         </w:tc>
@@ -1572,7 +1574,7 @@
               <w:br/>
               <w:t>(Chưa đến kỳ)</w:t>
               <w:br/>
-              <w:t>04/10/2026</w:t>
+              <w:t>08/10/2026</w:t>
             </w:r>
           </w:p>
         </w:tc>
@@ -1599,7 +1601,7 @@
               <w:br/>
               <w:t>(Chưa đến kỳ)</w:t>
               <w:br/>
-              <w:t>04/10/2026</w:t>
+              <w:t>08/10/2026</w:t>
             </w:r>
           </w:p>
         </w:tc>
@@ -1626,7 +1628,7 @@
               <w:br/>
               <w:t>(Chưa đến kỳ)</w:t>
               <w:br/>
-              <w:t>04/10/2026</w:t>
+              <w:t>08/10/2026</w:t>
             </w:r>
           </w:p>
         </w:tc>
@@ -1653,7 +1655,7 @@
               <w:br/>
               <w:t>(Chưa đến kỳ)</w:t>
               <w:br/>
-              <w:t>04/10/2026</w:t>
+              <w:t>08/10/2026</w:t>
             </w:r>
           </w:p>
         </w:tc>
@@ -1680,7 +1682,7 @@
               <w:br/>
               <w:t>(Chưa đến kỳ)</w:t>
               <w:br/>
-              <w:t>04/10/2026</w:t>
+              <w:t>08/10/2026</w:t>
             </w:r>
           </w:p>
         </w:tc>
@@ -1748,7 +1750,7 @@
               <w:left w:w="20" w:type="dxa"/>
               <w:right w:w="20" w:type="dxa"/>
             </w:tcMar>
-            <w:shd w:fill="FCE8E6"/>
+            <w:shd w:fill="E6F4EA"/>
           </w:tcPr>
           <w:p>
             <w:pPr>
@@ -1756,14 +1758,15 @@
             </w:pPr>
             <w:r>
               <w:rPr>
-                <w:color w:val="C5221F"/>
-                <w:sz w:val="15"/>
+                <w:b/>
+                <w:color w:val="0D652D"/>
+                <w:sz w:val="16"/>
               </w:rPr>
-              <w:t>❌ Chưa nộp</w:t>
+              <w:t>✔ Đã nộp</w:t>
               <w:br/>
-              <w:t>(0 tệp)</w:t>
+              <w:t>(19 tệp)</w:t>
               <w:br/>
-              <w:t>04/10/2026</w:t>
+              <w:t>08/10/2026</w:t>
             </w:r>
           </w:p>
         </w:tc>
@@ -1776,7 +1779,7 @@
               <w:left w:w="20" w:type="dxa"/>
               <w:right w:w="20" w:type="dxa"/>
             </w:tcMar>
-            <w:shd w:fill="FEF7E0"/>
+            <w:shd w:fill="E6F4EA"/>
           </w:tcPr>
           <w:p>
             <w:pPr>
@@ -1784,14 +1787,15 @@
             </w:pPr>
             <w:r>
               <w:rPr>
-                <w:color w:val="B06000"/>
-                <w:sz w:val="15"/>
+                <w:b/>
+                <w:color w:val="0D652D"/>
+                <w:sz w:val="16"/>
               </w:rPr>
-              <w:t>⏳ Chưa nộp</w:t>
+              <w:t>✔ Đã nộp</w:t>
               <w:br/>
-              <w:t>(Đang thu đợt 2)</w:t>
+              <w:t>(20 tệp)</w:t>
               <w:br/>
-              <w:t>04/10/2026</w:t>
+              <w:t>08/10/2026</w:t>
             </w:r>
           </w:p>
         </w:tc>
@@ -1818,7 +1822,7 @@
               <w:br/>
               <w:t>(Chưa đến kỳ)</w:t>
               <w:br/>
-              <w:t>04/10/2026</w:t>
+              <w:t>08/10/2026</w:t>
             </w:r>
           </w:p>
         </w:tc>
@@ -1845,7 +1849,7 @@
               <w:br/>
               <w:t>(Chưa đến kỳ)</w:t>
               <w:br/>
-              <w:t>04/10/2026</w:t>
+              <w:t>08/10/2026</w:t>
             </w:r>
           </w:p>
         </w:tc>
@@ -1872,7 +1876,7 @@
               <w:br/>
               <w:t>(Chưa đến kỳ)</w:t>
               <w:br/>
-              <w:t>04/10/2026</w:t>
+              <w:t>08/10/2026</w:t>
             </w:r>
           </w:p>
         </w:tc>
@@ -1899,7 +1903,7 @@
               <w:br/>
               <w:t>(Chưa đến kỳ)</w:t>
               <w:br/>
-              <w:t>04/10/2026</w:t>
+              <w:t>08/10/2026</w:t>
             </w:r>
           </w:p>
         </w:tc>
@@ -1926,7 +1930,7 @@
               <w:br/>
               <w:t>(Chưa đến kỳ)</w:t>
               <w:br/>
-              <w:t>04/10/2026</w:t>
+              <w:t>08/10/2026</w:t>
             </w:r>
           </w:p>
         </w:tc>
@@ -1953,7 +1957,7 @@
               <w:br/>
               <w:t>(Chưa đến kỳ)</w:t>
               <w:br/>
-              <w:t>04/10/2026</w:t>
+              <w:t>08/10/2026</w:t>
             </w:r>
           </w:p>
         </w:tc>
@@ -1980,7 +1984,7 @@
               <w:br/>
               <w:t>(Chưa đến kỳ)</w:t>
               <w:br/>
-              <w:t>04/10/2026</w:t>
+              <w:t>08/10/2026</w:t>
             </w:r>
           </w:p>
         </w:tc>
@@ -2064,7 +2068,7 @@
               <w:br/>
               <w:t>(4 tệp)</w:t>
               <w:br/>
-              <w:t>04/10/2026</w:t>
+              <w:t>08/10/2026</w:t>
             </w:r>
           </w:p>
         </w:tc>
@@ -2093,7 +2097,7 @@
               <w:br/>
               <w:t>(5 tệp)</w:t>
               <w:br/>
-              <w:t>04/10/2026</w:t>
+              <w:t>08/10/2026</w:t>
             </w:r>
           </w:p>
         </w:tc>
@@ -2120,7 +2124,7 @@
               <w:br/>
               <w:t>(Chưa đến kỳ)</w:t>
               <w:br/>
-              <w:t>04/10/2026</w:t>
+              <w:t>08/10/2026</w:t>
             </w:r>
           </w:p>
         </w:tc>
@@ -2147,7 +2151,7 @@
               <w:br/>
               <w:t>(Chưa đến kỳ)</w:t>
               <w:br/>
-              <w:t>04/10/2026</w:t>
+              <w:t>08/10/2026</w:t>
             </w:r>
           </w:p>
         </w:tc>
@@ -2174,7 +2178,7 @@
               <w:br/>
               <w:t>(Chưa đến kỳ)</w:t>
               <w:br/>
-              <w:t>04/10/2026</w:t>
+              <w:t>08/10/2026</w:t>
             </w:r>
           </w:p>
         </w:tc>
@@ -2201,7 +2205,7 @@
               <w:br/>
               <w:t>(Chưa đến kỳ)</w:t>
               <w:br/>
-              <w:t>04/10/2026</w:t>
+              <w:t>08/10/2026</w:t>
             </w:r>
           </w:p>
         </w:tc>
@@ -2228,7 +2232,7 @@
               <w:br/>
               <w:t>(Chưa đến kỳ)</w:t>
               <w:br/>
-              <w:t>04/10/2026</w:t>
+              <w:t>08/10/2026</w:t>
             </w:r>
           </w:p>
         </w:tc>
@@ -2255,7 +2259,7 @@
               <w:br/>
               <w:t>(Chưa đến kỳ)</w:t>
               <w:br/>
-              <w:t>04/10/2026</w:t>
+              <w:t>08/10/2026</w:t>
             </w:r>
           </w:p>
         </w:tc>
@@ -2282,7 +2286,7 @@
               <w:br/>
               <w:t>(Chưa đến kỳ)</w:t>
               <w:br/>
-              <w:t>04/10/2026</w:t>
+              <w:t>08/10/2026</w:t>
             </w:r>
           </w:p>
         </w:tc>
@@ -2364,9 +2368,9 @@
               </w:rPr>
               <w:t>✔ Đã nộp</w:t>
               <w:br/>
-              <w:t>(3 tệp)</w:t>
+              <w:t>(2 tệp)</w:t>
               <w:br/>
-              <w:t>04/10/2026</w:t>
+              <w:t>08/10/2026</w:t>
             </w:r>
           </w:p>
         </w:tc>
@@ -2379,7 +2383,7 @@
               <w:left w:w="20" w:type="dxa"/>
               <w:right w:w="20" w:type="dxa"/>
             </w:tcMar>
-            <w:shd w:fill="FEF7E0"/>
+            <w:shd w:fill="E6F4EA"/>
           </w:tcPr>
           <w:p>
             <w:pPr>
@@ -2387,14 +2391,15 @@
             </w:pPr>
             <w:r>
               <w:rPr>
-                <w:color w:val="B06000"/>
-                <w:sz w:val="15"/>
+                <w:b/>
+                <w:color w:val="0D652D"/>
+                <w:sz w:val="16"/>
               </w:rPr>
-              <w:t>⏳ Chưa nộp</w:t>
+              <w:t>✔ Đã nộp</w:t>
               <w:br/>
-              <w:t>(Đang thu đợt 2)</w:t>
+              <w:t>(13 tệp)</w:t>
               <w:br/>
-              <w:t>04/10/2026</w:t>
+              <w:t>08/10/2026</w:t>
             </w:r>
           </w:p>
         </w:tc>
@@ -2421,7 +2426,7 @@
               <w:br/>
               <w:t>(Chưa đến kỳ)</w:t>
               <w:br/>
-              <w:t>04/10/2026</w:t>
+              <w:t>08/10/2026</w:t>
             </w:r>
           </w:p>
         </w:tc>
@@ -2448,7 +2453,7 @@
               <w:br/>
               <w:t>(Chưa đến kỳ)</w:t>
               <w:br/>
-              <w:t>04/10/2026</w:t>
+              <w:t>08/10/2026</w:t>
             </w:r>
           </w:p>
         </w:tc>
@@ -2475,7 +2480,7 @@
               <w:br/>
               <w:t>(Chưa đến kỳ)</w:t>
               <w:br/>
-              <w:t>04/10/2026</w:t>
+              <w:t>08/10/2026</w:t>
             </w:r>
           </w:p>
         </w:tc>
@@ -2502,7 +2507,7 @@
               <w:br/>
               <w:t>(Chưa đến kỳ)</w:t>
               <w:br/>
-              <w:t>04/10/2026</w:t>
+              <w:t>08/10/2026</w:t>
             </w:r>
           </w:p>
         </w:tc>
@@ -2529,7 +2534,7 @@
               <w:br/>
               <w:t>(Chưa đến kỳ)</w:t>
               <w:br/>
-              <w:t>04/10/2026</w:t>
+              <w:t>08/10/2026</w:t>
             </w:r>
           </w:p>
         </w:tc>
@@ -2556,7 +2561,7 @@
               <w:br/>
               <w:t>(Chưa đến kỳ)</w:t>
               <w:br/>
-              <w:t>04/10/2026</w:t>
+              <w:t>08/10/2026</w:t>
             </w:r>
           </w:p>
         </w:tc>
@@ -2583,7 +2588,7 @@
               <w:br/>
               <w:t>(Chưa đến kỳ)</w:t>
               <w:br/>
-              <w:t>04/10/2026</w:t>
+              <w:t>08/10/2026</w:t>
             </w:r>
           </w:p>
         </w:tc>
@@ -2666,7 +2671,7 @@
               <w:br/>
               <w:t>(0 tệp)</w:t>
               <w:br/>
-              <w:t>04/10/2026</w:t>
+              <w:t>08/10/2026</w:t>
             </w:r>
           </w:p>
         </w:tc>
@@ -2694,7 +2699,7 @@
               <w:br/>
               <w:t>(Đang thu đợt 2)</w:t>
               <w:br/>
-              <w:t>04/10/2026</w:t>
+              <w:t>08/10/2026</w:t>
             </w:r>
           </w:p>
         </w:tc>
@@ -2721,7 +2726,7 @@
               <w:br/>
               <w:t>(Chưa đến kỳ)</w:t>
               <w:br/>
-              <w:t>04/10/2026</w:t>
+              <w:t>08/10/2026</w:t>
             </w:r>
           </w:p>
         </w:tc>
@@ -2748,7 +2753,7 @@
               <w:br/>
               <w:t>(Chưa đến kỳ)</w:t>
               <w:br/>
-              <w:t>04/10/2026</w:t>
+              <w:t>08/10/2026</w:t>
             </w:r>
           </w:p>
         </w:tc>
@@ -2775,7 +2780,7 @@
               <w:br/>
               <w:t>(Chưa đến kỳ)</w:t>
               <w:br/>
-              <w:t>04/10/2026</w:t>
+              <w:t>08/10/2026</w:t>
             </w:r>
           </w:p>
         </w:tc>
@@ -2802,7 +2807,7 @@
               <w:br/>
               <w:t>(Chưa đến kỳ)</w:t>
               <w:br/>
-              <w:t>04/10/2026</w:t>
+              <w:t>08/10/2026</w:t>
             </w:r>
           </w:p>
         </w:tc>
@@ -2829,7 +2834,7 @@
               <w:br/>
               <w:t>(Chưa đến kỳ)</w:t>
               <w:br/>
-              <w:t>04/10/2026</w:t>
+              <w:t>08/10/2026</w:t>
             </w:r>
           </w:p>
         </w:tc>
@@ -2856,7 +2861,7 @@
               <w:br/>
               <w:t>(Chưa đến kỳ)</w:t>
               <w:br/>
-              <w:t>04/10/2026</w:t>
+              <w:t>08/10/2026</w:t>
             </w:r>
           </w:p>
         </w:tc>
@@ -2883,7 +2888,7 @@
               <w:br/>
               <w:t>(Chưa đến kỳ)</w:t>
               <w:br/>
-              <w:t>04/10/2026</w:t>
+              <w:t>08/10/2026</w:t>
             </w:r>
           </w:p>
         </w:tc>

</xml_diff>

<commit_message>
fix(drive-sync): Quet de quy sau toan bo thu muc long cua Thay Thanh (30 tep) va toan to (172 tep)
</commit_message>
<xml_diff>
--- a/data/corrected/BAO_CAO_CHI_TIET_TIEN_DO_9_CHU_KY_TUAN_GOOGLE_DRIVE.docx
+++ b/data/corrected/BAO_CAO_CHI_TIET_TIEN_DO_9_CHU_KY_TUAN_GOOGLE_DRIVE.docx
@@ -831,7 +831,7 @@
                 <w:i/>
                 <w:sz w:val="17"/>
               </w:rPr>
-              <w:t>(CN 6, CN 7, HĐTN 6, 7, 9)</w:t>
+              <w:t>(CN 6, CN 7, HĐTN 6, HĐTN 7, HĐTN 9)</w:t>
             </w:r>
           </w:p>
         </w:tc>
@@ -1133,7 +1133,7 @@
                 <w:i/>
                 <w:sz w:val="17"/>
               </w:rPr>
-              <w:t>(HĐTN 8, KHTN 6, KHTN 8)</w:t>
+              <w:t>(KHTN 6, KHTN 8, HĐTN 8)</w:t>
             </w:r>
           </w:p>
         </w:tc>
@@ -1189,7 +1189,7 @@
               </w:rPr>
               <w:t>✔ Đã nộp</w:t>
               <w:br/>
-              <w:t>(12 tệp)</w:t>
+              <w:t>(13 tệp)</w:t>
               <w:br/>
               <w:t>08/10/2026</w:t>
             </w:r>
@@ -1204,6 +1204,7 @@
               <w:left w:w="20" w:type="dxa"/>
               <w:right w:w="20" w:type="dxa"/>
             </w:tcMar>
+            <w:shd w:fill="E6F4EA"/>
           </w:tcPr>
           <w:p>
             <w:pPr>
@@ -1211,12 +1212,13 @@
             </w:pPr>
             <w:r>
               <w:rPr>
-                <w:color w:val="808080"/>
-                <w:sz w:val="14"/>
+                <w:b/>
+                <w:color w:val="0D652D"/>
+                <w:sz w:val="16"/>
               </w:rPr>
-              <w:t>○ Trống</w:t>
+              <w:t>✔ Đã nộp</w:t>
               <w:br/>
-              <w:t>(Chưa đến kỳ)</w:t>
+              <w:t>(1 tệp)</w:t>
               <w:br/>
               <w:t>08/10/2026</w:t>
             </w:r>
@@ -2341,7 +2343,7 @@
                 <w:i/>
                 <w:sz w:val="17"/>
               </w:rPr>
-              <w:t>(HĐTN 8, KHTN 6, 8, 9)</w:t>
+              <w:t>(KHTN 6, KHTN 8, KHTN 9, HĐTN 8)</w:t>
             </w:r>
           </w:p>
         </w:tc>
@@ -2368,7 +2370,7 @@
               </w:rPr>
               <w:t>✔ Đã nộp</w:t>
               <w:br/>
-              <w:t>(2 tệp)</w:t>
+              <w:t>(17 tệp)</w:t>
               <w:br/>
               <w:t>08/10/2026</w:t>
             </w:r>
@@ -2643,7 +2645,7 @@
                 <w:i/>
                 <w:sz w:val="17"/>
               </w:rPr>
-              <w:t>(Hóa 9, KHTN 7)</w:t>
+              <w:t>(Hóa 9, KHTN 7, Toán 9)</w:t>
             </w:r>
           </w:p>
         </w:tc>

</xml_diff>